<commit_message>
update cong viec 19/10
</commit_message>
<xml_diff>
--- a/report/Bao_cao_Cuoi_ky_Nhom7_CRISP_DM.docx
+++ b/report/Bao_cao_Cuoi_ky_Nhom7_CRISP_DM.docx
@@ -189,7 +189,7 @@
         <w:br/>
         <w:t>Thực nghiệm chính: 11/10/2026</w:t>
         <w:br/>
-        <w:t>Thực nghiệm bổ sung và rà soát: 18/10/2026</w:t>
+        <w:t>Thực nghiệm bổ sung và rà soát: 19/10/2026</w:t>
       </w:r>
     </w:p>
     <w:p>
@@ -220,22 +220,22 @@
     </w:p>
     <w:p>
       <w:r>
-        <w:t>Sau khi chọn ngưỡng −0,373176 trên validation và khóa pipeline, test giữ riêng theo nhóm nội dung gồm 3.389 tin cho AP 0,878, precision 74,53%, recall 83,33% và F1 0,787. Hệ thống phát hiện 120/144 tin giả và cảnh báo nhầm 41 tin thật. Riêng 841 tin không có hoặc chưa thấy company_profile trong train, precision là 72,22% và recall 79,82%. Đây là lát cắt hậu kiểm, chưa phải kiểm chứng độc lập trên doanh nghiệp mới hoặc thị trường Việt Nam.</w:t>
+        <w:t>Test tại ngưỡng đã khóa cho AP 0,878; precision 74,53%; recall 83,33%; F1 0,787. Mô hình phát hiện 120/144 tin giả, cảnh báo nhầm 41 tin thật trên 3.389 tin test. Precision chưa đạt mục tiêu 80%; sản phẩm phù hợp minh họa hỗ trợ kiểm duyệt, chưa đủ căn cứ nghiệm thu vận hành.</w:t>
       </w:r>
     </w:p>
     <w:p>
       <w:r>
-        <w:t>Mục tiêu nghiệp vụ precision tối thiểu 80% chưa đạt trên test. Vì vậy sản phẩm ở mức minh họa nghiên cứu, chưa đủ căn cứ nghiệm thu vận hành theo mục tiêu này. Không thay ngưỡng sau khi biết kết quả test.</w:t>
+        <w:t>Ngưỡng −0,373176 được chọn trên validation trước khi mở test. Pipeline và ngưỡng được giữ nguyên; các phân tích bổ sung không thay kết quả đánh giá này.</w:t>
       </w:r>
     </w:p>
     <w:p>
       <w:r>
-        <w:t>Thực nghiệm bổ sung ngày 18/10 tách lựa chọn và đánh giá bằng nested CV: AP outer trung bình 0,839 cho SVM và 0,834 cho LR. Báo cáo đồng thời bổ sung ablation SVM, hiệu chỉnh xác suất trên validation và các kịch bản chi phí; các kết quả này không thay mô hình hoặc ngưỡng đã khóa.</w:t>
+        <w:t>Nested CV trên train cho AP outer 0,839 (SVM) và 0,834 (LR). Kiểm tra bổ sung ngày 19/10 với nhóm kết hợp nội dung và profile cho SVM cố định AP 0,650 ± 0,177: khả năng xếp hạng biến động mạnh theo nhóm. Đây là các thiết kế khác nhau, không dùng chênh lệch điểm để quy kết nhân quả hoặc tuyên bố cải thiện.</w:t>
       </w:r>
     </w:p>
     <w:p>
       <w:r>
-        <w:t>Báo cáo trình bày sáu giai đoạn CRISP-DM, tổng kết dự án và minh chứng. Các phân tích bổ sung gồm chẩn đoán profile, so sánh pipeline, nested CV, ablation SVM, calibration và độ nhạy chi phí; mô hình triển khai giữ nguyên kết quả đã khóa.</w:t>
+        <w:t>Báo cáo trình bày sáu giai đoạn CRISP-DM, kết quả khóa, phân tích sai số và độ bền. Thời gian chạy được đo lặp năm lần mỗi pipeline; dữ liệu, mã, manifest, notebook và minh chứng demo đi kèm để kiểm tra lại.</w:t>
       </w:r>
     </w:p>
     <w:p>
@@ -6804,6 +6804,445 @@
         <w:pageBreakBefore/>
       </w:pPr>
       <w:r>
+        <w:t>5.7.1 Kiểm tra nhóm kết hợp nội dung và hồ sơ</w:t>
+      </w:r>
+    </w:p>
+    <w:p>
+      <w:r>
+        <w:t>AP trung bình của SVM cố định là 0,650 ± 0,177 trên ba fold, dao động từ 0,446 đến 0,768. Kết quả cho thấy độ nhạy đáng kể theo nhóm hồ sơ và củng cố nhu cầu đánh giá với nhà tuyển dụng mới trước vận hành.</w:t>
+      </w:r>
+    </w:p>
+    <w:p>
+      <w:r>
+        <w:t>Chỉ dùng 10.836 tin train. Hai tin được nối nếu chung content_group hoặc chung company_profile không rỗng sau chuẩn hóa chữ thường/khoảng trắng; lấy thành phần liên thông để xử lý nối bắc cầu. Có 3.256 nhóm, nhóm lớn nhất 589 tin; 1.987 tin thiếu profile chỉ được nhóm theo nội dung. Không gộp mọi profile thiếu thành một công ty.</w:t>
+      </w:r>
+    </w:p>
+    <w:p>
+      <w:r>
+        <w:t>StratifiedGroupKFold 3 fold, seed 20261019; SVM C=1, class_weight=None cố định, preprocessing fit riêng mỗi fold. Các cột giao nhóm nội dung và giao profile không rỗng đều bằng 0. Mỗi tin train được chấm đúng một lần; cả tập fit và eval từng fold đều có đủ hai lớp.</w:t>
+      </w:r>
+    </w:p>
+    <w:tbl>
+      <w:tblPr>
+        <w:tblStyle w:val="TableGrid"/>
+        <w:tblW w:type="auto" w:w="0"/>
+        <w:tblLook w:firstColumn="1" w:firstRow="1" w:lastColumn="0" w:lastRow="0" w:noHBand="0" w:noVBand="1" w:val="04A0"/>
+      </w:tblPr>
+      <w:tblGrid>
+        <w:gridCol w:w="1882"/>
+        <w:gridCol w:w="1882"/>
+        <w:gridCol w:w="1882"/>
+        <w:gridCol w:w="1882"/>
+        <w:gridCol w:w="1882"/>
+      </w:tblGrid>
+      <w:tr>
+        <w:trPr>
+          <w:cantSplit/>
+          <w:tblHeader/>
+        </w:trPr>
+        <w:tc>
+          <w:tcPr>
+            <w:tcW w:type="dxa" w:w="1882"/>
+            <w:shd w:fill="E8EEF2"/>
+          </w:tcPr>
+          <w:p>
+            <w:pPr>
+              <w:spacing w:after="60"/>
+            </w:pPr>
+            <w:r>
+              <w:rPr>
+                <w:rFonts w:ascii="Times New Roman" w:hAnsi="Times New Roman"/>
+                <w:b/>
+                <w:sz w:val="22"/>
+              </w:rPr>
+              <w:t>Fold</w:t>
+            </w:r>
+          </w:p>
+        </w:tc>
+        <w:tc>
+          <w:tcPr>
+            <w:tcW w:type="dxa" w:w="1882"/>
+            <w:shd w:fill="E8EEF2"/>
+          </w:tcPr>
+          <w:p>
+            <w:pPr>
+              <w:spacing w:after="60"/>
+            </w:pPr>
+            <w:r>
+              <w:rPr>
+                <w:rFonts w:ascii="Times New Roman" w:hAnsi="Times New Roman"/>
+                <w:b/>
+                <w:sz w:val="22"/>
+              </w:rPr>
+              <w:t>Tin fit / giả</w:t>
+            </w:r>
+          </w:p>
+        </w:tc>
+        <w:tc>
+          <w:tcPr>
+            <w:tcW w:type="dxa" w:w="1882"/>
+            <w:shd w:fill="E8EEF2"/>
+          </w:tcPr>
+          <w:p>
+            <w:pPr>
+              <w:spacing w:after="60"/>
+            </w:pPr>
+            <w:r>
+              <w:rPr>
+                <w:rFonts w:ascii="Times New Roman" w:hAnsi="Times New Roman"/>
+                <w:b/>
+                <w:sz w:val="22"/>
+              </w:rPr>
+              <w:t>Tin eval / giả</w:t>
+            </w:r>
+          </w:p>
+        </w:tc>
+        <w:tc>
+          <w:tcPr>
+            <w:tcW w:type="dxa" w:w="1882"/>
+            <w:shd w:fill="E8EEF2"/>
+          </w:tcPr>
+          <w:p>
+            <w:pPr>
+              <w:spacing w:after="60"/>
+            </w:pPr>
+            <w:r>
+              <w:rPr>
+                <w:rFonts w:ascii="Times New Roman" w:hAnsi="Times New Roman"/>
+                <w:b/>
+                <w:sz w:val="22"/>
+              </w:rPr>
+              <w:t>AP</w:t>
+            </w:r>
+          </w:p>
+        </w:tc>
+        <w:tc>
+          <w:tcPr>
+            <w:tcW w:type="dxa" w:w="1882"/>
+            <w:shd w:fill="E8EEF2"/>
+          </w:tcPr>
+          <w:p>
+            <w:pPr>
+              <w:spacing w:after="60"/>
+            </w:pPr>
+            <w:r>
+              <w:rPr>
+                <w:rFonts w:ascii="Times New Roman" w:hAnsi="Times New Roman"/>
+                <w:b/>
+                <w:sz w:val="22"/>
+              </w:rPr>
+              <w:t>Giao nhóm</w:t>
+            </w:r>
+          </w:p>
+        </w:tc>
+      </w:tr>
+      <w:tr>
+        <w:trPr>
+          <w:cantSplit/>
+        </w:trPr>
+        <w:tc>
+          <w:tcPr>
+            <w:tcW w:type="dxa" w:w="1882"/>
+          </w:tcPr>
+          <w:p>
+            <w:pPr>
+              <w:spacing w:after="60"/>
+            </w:pPr>
+            <w:r>
+              <w:rPr>
+                <w:rFonts w:ascii="Times New Roman" w:hAnsi="Times New Roman"/>
+                <w:b w:val="0"/>
+                <w:sz w:val="22"/>
+              </w:rPr>
+              <w:t>1</w:t>
+            </w:r>
+          </w:p>
+        </w:tc>
+        <w:tc>
+          <w:tcPr>
+            <w:tcW w:type="dxa" w:w="1882"/>
+          </w:tcPr>
+          <w:p>
+            <w:pPr>
+              <w:spacing w:after="60"/>
+            </w:pPr>
+            <w:r>
+              <w:rPr>
+                <w:rFonts w:ascii="Times New Roman" w:hAnsi="Times New Roman"/>
+                <w:b w:val="0"/>
+                <w:sz w:val="22"/>
+              </w:rPr>
+              <w:t>7007 / 315</w:t>
+            </w:r>
+          </w:p>
+        </w:tc>
+        <w:tc>
+          <w:tcPr>
+            <w:tcW w:type="dxa" w:w="1882"/>
+          </w:tcPr>
+          <w:p>
+            <w:pPr>
+              <w:spacing w:after="60"/>
+            </w:pPr>
+            <w:r>
+              <w:rPr>
+                <w:rFonts w:ascii="Times New Roman" w:hAnsi="Times New Roman"/>
+                <w:b w:val="0"/>
+                <w:sz w:val="22"/>
+              </w:rPr>
+              <w:t>3829 / 215</w:t>
+            </w:r>
+          </w:p>
+        </w:tc>
+        <w:tc>
+          <w:tcPr>
+            <w:tcW w:type="dxa" w:w="1882"/>
+          </w:tcPr>
+          <w:p>
+            <w:pPr>
+              <w:spacing w:after="60"/>
+            </w:pPr>
+            <w:r>
+              <w:rPr>
+                <w:rFonts w:ascii="Times New Roman" w:hAnsi="Times New Roman"/>
+                <w:b w:val="0"/>
+                <w:sz w:val="22"/>
+              </w:rPr>
+              <w:t>0,736</w:t>
+            </w:r>
+          </w:p>
+        </w:tc>
+        <w:tc>
+          <w:tcPr>
+            <w:tcW w:type="dxa" w:w="1882"/>
+          </w:tcPr>
+          <w:p>
+            <w:pPr>
+              <w:spacing w:after="60"/>
+            </w:pPr>
+            <w:r>
+              <w:rPr>
+                <w:rFonts w:ascii="Times New Roman" w:hAnsi="Times New Roman"/>
+                <w:b w:val="0"/>
+                <w:sz w:val="22"/>
+              </w:rPr>
+              <w:t>0</w:t>
+            </w:r>
+          </w:p>
+        </w:tc>
+      </w:tr>
+      <w:tr>
+        <w:trPr>
+          <w:cantSplit/>
+        </w:trPr>
+        <w:tc>
+          <w:tcPr>
+            <w:tcW w:type="dxa" w:w="1882"/>
+          </w:tcPr>
+          <w:p>
+            <w:pPr>
+              <w:spacing w:after="60"/>
+            </w:pPr>
+            <w:r>
+              <w:rPr>
+                <w:rFonts w:ascii="Times New Roman" w:hAnsi="Times New Roman"/>
+                <w:b w:val="0"/>
+                <w:sz w:val="22"/>
+              </w:rPr>
+              <w:t>2</w:t>
+            </w:r>
+          </w:p>
+        </w:tc>
+        <w:tc>
+          <w:tcPr>
+            <w:tcW w:type="dxa" w:w="1882"/>
+          </w:tcPr>
+          <w:p>
+            <w:pPr>
+              <w:spacing w:after="60"/>
+            </w:pPr>
+            <w:r>
+              <w:rPr>
+                <w:rFonts w:ascii="Times New Roman" w:hAnsi="Times New Roman"/>
+                <w:b w:val="0"/>
+                <w:sz w:val="22"/>
+              </w:rPr>
+              <w:t>8122 / 385</w:t>
+            </w:r>
+          </w:p>
+        </w:tc>
+        <w:tc>
+          <w:tcPr>
+            <w:tcW w:type="dxa" w:w="1882"/>
+          </w:tcPr>
+          <w:p>
+            <w:pPr>
+              <w:spacing w:after="60"/>
+            </w:pPr>
+            <w:r>
+              <w:rPr>
+                <w:rFonts w:ascii="Times New Roman" w:hAnsi="Times New Roman"/>
+                <w:b w:val="0"/>
+                <w:sz w:val="22"/>
+              </w:rPr>
+              <w:t>2714 / 145</w:t>
+            </w:r>
+          </w:p>
+        </w:tc>
+        <w:tc>
+          <w:tcPr>
+            <w:tcW w:type="dxa" w:w="1882"/>
+          </w:tcPr>
+          <w:p>
+            <w:pPr>
+              <w:spacing w:after="60"/>
+            </w:pPr>
+            <w:r>
+              <w:rPr>
+                <w:rFonts w:ascii="Times New Roman" w:hAnsi="Times New Roman"/>
+                <w:b w:val="0"/>
+                <w:sz w:val="22"/>
+              </w:rPr>
+              <w:t>0,768</w:t>
+            </w:r>
+          </w:p>
+        </w:tc>
+        <w:tc>
+          <w:tcPr>
+            <w:tcW w:type="dxa" w:w="1882"/>
+          </w:tcPr>
+          <w:p>
+            <w:pPr>
+              <w:spacing w:after="60"/>
+            </w:pPr>
+            <w:r>
+              <w:rPr>
+                <w:rFonts w:ascii="Times New Roman" w:hAnsi="Times New Roman"/>
+                <w:b w:val="0"/>
+                <w:sz w:val="22"/>
+              </w:rPr>
+              <w:t>0</w:t>
+            </w:r>
+          </w:p>
+        </w:tc>
+      </w:tr>
+      <w:tr>
+        <w:trPr>
+          <w:cantSplit/>
+        </w:trPr>
+        <w:tc>
+          <w:tcPr>
+            <w:tcW w:type="dxa" w:w="1882"/>
+          </w:tcPr>
+          <w:p>
+            <w:pPr>
+              <w:spacing w:after="60"/>
+            </w:pPr>
+            <w:r>
+              <w:rPr>
+                <w:rFonts w:ascii="Times New Roman" w:hAnsi="Times New Roman"/>
+                <w:b w:val="0"/>
+                <w:sz w:val="22"/>
+              </w:rPr>
+              <w:t>3</w:t>
+            </w:r>
+          </w:p>
+        </w:tc>
+        <w:tc>
+          <w:tcPr>
+            <w:tcW w:type="dxa" w:w="1882"/>
+          </w:tcPr>
+          <w:p>
+            <w:pPr>
+              <w:spacing w:after="60"/>
+            </w:pPr>
+            <w:r>
+              <w:rPr>
+                <w:rFonts w:ascii="Times New Roman" w:hAnsi="Times New Roman"/>
+                <w:b w:val="0"/>
+                <w:sz w:val="22"/>
+              </w:rPr>
+              <w:t>6543 / 360</w:t>
+            </w:r>
+          </w:p>
+        </w:tc>
+        <w:tc>
+          <w:tcPr>
+            <w:tcW w:type="dxa" w:w="1882"/>
+          </w:tcPr>
+          <w:p>
+            <w:pPr>
+              <w:spacing w:after="60"/>
+            </w:pPr>
+            <w:r>
+              <w:rPr>
+                <w:rFonts w:ascii="Times New Roman" w:hAnsi="Times New Roman"/>
+                <w:b w:val="0"/>
+                <w:sz w:val="22"/>
+              </w:rPr>
+              <w:t>4293 / 170</w:t>
+            </w:r>
+          </w:p>
+        </w:tc>
+        <w:tc>
+          <w:tcPr>
+            <w:tcW w:type="dxa" w:w="1882"/>
+          </w:tcPr>
+          <w:p>
+            <w:pPr>
+              <w:spacing w:after="60"/>
+            </w:pPr>
+            <w:r>
+              <w:rPr>
+                <w:rFonts w:ascii="Times New Roman" w:hAnsi="Times New Roman"/>
+                <w:b w:val="0"/>
+                <w:sz w:val="22"/>
+              </w:rPr>
+              <w:t>0,446</w:t>
+            </w:r>
+          </w:p>
+        </w:tc>
+        <w:tc>
+          <w:tcPr>
+            <w:tcW w:type="dxa" w:w="1882"/>
+          </w:tcPr>
+          <w:p>
+            <w:pPr>
+              <w:spacing w:after="60"/>
+            </w:pPr>
+            <w:r>
+              <w:rPr>
+                <w:rFonts w:ascii="Times New Roman" w:hAnsi="Times New Roman"/>
+                <w:b w:val="0"/>
+                <w:sz w:val="22"/>
+              </w:rPr>
+              <w:t>0</w:t>
+            </w:r>
+          </w:p>
+        </w:tc>
+      </w:tr>
+    </w:tbl>
+    <w:p>
+      <w:r>
+        <w:t>Phân tầng theo nhóm chỉ cố gắng giữ tỷ lệ lớp, không bảo đảm số mẫu bằng nhau [3]. Số tin giả eval lần lượt 215, 145 và 170; kích thước nhóm hạn chế khả năng cân bằng. SD trên ba fold mô tả biến động, không phải khoảng tin cậy.</w:t>
+      </w:r>
+    </w:p>
+    <w:p>
+      <w:r>
+        <w:t>Cấu hình đã được chọn trên train trước đây nên đây là chẩn đoán sau khóa, chưa phải nested CV theo profile. Profile khớp chính xác vẫn không tương đương company ID: cùng doanh nghiệp có thể viết khác, nhiều doanh nghiệp có thể dùng chung mẫu. Thiết kế cũng đổi seed, tập fit và phân bố; không quy toàn bộ chênh AP với CV cũ cho rò rỉ doanh nghiệp.</w:t>
+      </w:r>
+    </w:p>
+    <w:p>
+      <w:r>
+        <w:t>Nguồn: scripts/audit_generalization.py và results/generalization_2026-10-19/profile_folds.csv, profile_predictions.csv, profile_group_manifest.csv. Kết quả test, mô hình và ngưỡng triển khai không đổi. Chưa có dữ liệu ngoài nguồn được xác minh để thực hiện đánh giá xác nhận.</w:t>
+      </w:r>
+    </w:p>
+    <w:p>
+      <w:pPr>
+        <w:pStyle w:val="Heading2"/>
+        <w:pageBreakBefore/>
+      </w:pPr>
+      <w:r>
         <w:rPr>
           <w:color w:val="000000"/>
         </w:rPr>
@@ -6812,12 +7251,12 @@
     </w:p>
     <w:p>
       <w:r>
-        <w:t>Pipeline GB đạt AP CV 0,849, cao hơn SVM 0,831 trong đối chiếu bổ sung. NB chỉ dùng TF-IDF không âm; GB dùng SelectKBest ANOVA F chọn 2.000 đặc trưng kết hợp trong mỗi fold. Mỗi họ thêm tám cấu hình. Vì khác biểu diễn, đây là so sánh pipeline. Các kết quả dùng train/validation và được thực hiện sau khóa, không thay quyết định đánh giá hoặc chấm phương án mới trên test.</w:t>
+        <w:t>GB đạt AP CV 0,849 so với SVM 0,831 trong đối chiếu bổ sung. NB dùng TF-IDF; GB chọn 2.000 đặc trưng bằng ANOVA F trong mỗi fold. Mỗi họ thử tám cấu hình. Do khác biểu diễn, đây là so sánh pipeline sau khóa, không thay mô hình đã đánh giá trên test.</w:t>
       </w:r>
     </w:p>
     <w:p>
       <w:r>
-        <w:t xml:space="preserve">Về ưu và nhược: Naive Bayes giả định các từ độc lập có điều kiện theo lớp nên chỉ cần một lượt đếm và rất rẻ, nhưng giả định này bị vi phạm khi các cụm từ tương quan mạnh và xác suất đầu ra kém hiệu chỉnh. Gradient Boosting cộng dồn cây nông nên bắt được tương tác phi tuyến giữa các đặc trưng, đổi lại chi phí cao hơn nhiều (bảng dưới), nhiều siêu tham số và dễ quá khớp khi lớp thiểu số chỉ khoảng 5%.</w:t>
+        <w:t>NB tính toán rẻ nhưng giả định độc lập có điều kiện giữa các từ; GB mô hình hóa tương tác phi tuyến với chi phí fit cao hơn. Cả hai cần kiểm soát quá khớp trên lớp giả ít mẫu.</w:t>
       </w:r>
     </w:p>
     <w:tbl>
@@ -7390,7 +7829,7 @@
     </w:p>
     <w:p>
       <w:r>
-        <w:t>Nguồn: results/extension/validation_compare.json, lượt chạy bổ sung Python 3.12.3, scikit-learn 1.7.2. Cột thời gian lịch sử tính classifier.fit + dự đoán validation + tính AP, không gồm preprocessing; không phải thời gian fit thuần. RF dùng n_jobs=2; BLAS/OpenMP giới hạn 1. Phần cứng và các phiên bản thư viện khác của lượt này chưa được ghi đầy đủ, nên không suy ra hệ số tăng tốc ổn định. Bảng 5.1 là thời gian fit trung bình mỗi fold của lượt chính, không so trực tiếp với cột này.</w:t>
+        <w:t>Nguồn lịch sử: results/extension/validation_compare.json; Python 3.12.3, sklearn 1.7.2, RF n_jobs=2, native pool=1. Thời gian gồm fit + chấm validation + AP, không có preprocessing. Thiếu metadata máy của lượt cũ; không so trực tiếp với fit trung bình CV ở mục 5.1. Benchmark lặp mới ở mục 5.12 tách fit và prediction.</w:t>
       </w:r>
     </w:p>
     <w:tbl>
@@ -7960,22 +8399,22 @@
     </w:p>
     <w:p>
       <w:r>
-        <w:t>Các giá trị dưới đây chỉ dùng thăm dò. Nadeau–Bengio dùng hệ số phương sai (1/5 + 1/4); Holm hiệu chỉnh bốn so sánh. Các tập fit vẫn chồng lấn và cấu hình tốt nhất được chọn trên chính năm fold. Hiệu chỉnh không loại bỏ thiên lệch chọn lựa hoặc tạo ra các quan sát độc lập. Friedman cho χ²=16,0, p=0,003; đây không phải thiết kế nhiều dataset độc lập của Demšar [12], nên không dùng p này khẳng định các pipeline có chất lượng khác nhau.</w:t>
+        <w:t>Kiểm định chỉ mang tính thăm dò: năm tập fit chồng lấn và cũng dùng chọn cấu hình. Nadeau–Bengio dùng hệ số (1/5 + 1/4); Holm hiệu chỉnh bốn so sánh, nhưng không loại bỏ thiên lệch chọn lựa. Friedman χ²=16,0, p=0,003 trên các fold không đáp ứng thiết kế nhiều dataset độc lập [12].</w:t>
       </w:r>
     </w:p>
     <w:p>
       <w:r>
-        <w:t>SVM có AP cao hơn NB ở 5/5 fold; chênh AP trung bình 0,085 và khoảng bootstrap validation không chứa 0. Đây là tín hiệu mô tả để nghiên cứu tiếp, chưa phải bằng chứng xác nhận (p sau Nadeau–Bengio và Holm = 0,129). GB có AP CV cao hơn SVM 0,018 và validation cao hơn khoảng 0,014; p Nadeau–Bengio = 0,386, sau Holm = 1,000. Không bác bỏ một giả thuyết không đồng nghĩa chứng minh tương đương; cũng không kết luận LR/RF tương đương SVM hoặc Friedman khác biệt chủ yếu do NB. Validation đã tham gia chọn ngưỡng nên bootstrap tại đây cũng chỉ là chẩn đoán.</w:t>
+        <w:t>SVM hơn NB 5/5 fold (ΔAP=0,085; p hiệu chỉnh=0,129). GB hơn SVM 0,018 AP CV; p sau Holm=1,000. Không suy ưu thế hay tương đương từ các p-value này. Bootstrap validation cũng là chẩn đoán vì validation đã dùng chọn ngưỡng.</w:t>
       </w:r>
     </w:p>
     <w:p>
       <w:r>
-        <w:t>Nếu pipeline GB nằm trong lưới ban đầu thì quy tắc AP CV cao nhất sẽ chọn nó trong kết quả hiện có. Bản triển khai giữ SVM đã khóa để bảo toàn quyết định đánh giá ban đầu; đây không phải tuyên bố SVM là pipeline tốt nhất. Đánh giá tiếp cần protocol mới, tuning trong inner CV, đánh giá ở outer CV có nhóm doanh nghiệp và một holdout mới chưa dùng ra quyết định [13]. Nếu muốn cô lập thuật toán, cần so sánh trên cùng biểu diễn tương thích và ngân sách tuning được quy định trước.</w:t>
+        <w:t>Nếu GB có trong lưới ban đầu, quy tắc AP CV cao nhất sẽ chọn pipeline GB. Giữ SVM nhằm bảo toàn đánh giá đã khóa, không khẳng định SVM tốt nhất. Nested CV hiện chỉ có LR/SVM; RF/NB/GB cần thiết kế đánh giá mới trước khi lựa chọn triển khai.</w:t>
       </w:r>
     </w:p>
     <w:p>
       <w:r>
-        <w:t>Đối chiếu năm pipeline này chưa dùng nested CV chung. Phần 5.10 bổ sung nested CV riêng cho LR/SVM trên cùng biểu diễn. SVM refit lịch sử có AP validation 0,903770 so với 0,903553 đã khóa; chưa cô lập nguyên nhân khác biệt môi trường/biểu diễn ma trận, nên không gọi là tái lập chính xác. measurement_provenance.json giữ nguồn cũ; phần 5.12 cung cấp phép đo mới có thông tin phần cứng và tách fit/predict.</w:t>
+        <w:t>SVM refit lịch sử đạt AP validation 0,903770, khác 0,903553 của bundle khóa; chưa cô lập nguyên nhân nên không gọi là tái lập chính xác. Nguồn cũ được giữ trong measurement_provenance.json.</w:t>
       </w:r>
     </w:p>
     <w:p>
@@ -9711,7 +10150,7 @@
         <w:pageBreakBefore/>
       </w:pPr>
       <w:r>
-        <w:t>5.12 Độ nhạy chi phí và phép đo tài nguyên mới</w:t>
+        <w:t>5.12 Độ nhạy chi phí và benchmark lặp</w:t>
       </w:r>
     </w:p>
     <w:p>
@@ -10206,7 +10645,7 @@
     </w:p>
     <w:p>
       <w:r>
-        <w:t>Đo mới ngày 18/10: AMD Ryzen 5 7235HS, 8 luồng logic, khoảng 16 GB RAM; Python 3.12.14 và các thư viện ghim trong requirements.txt. BLAS/OpenMP giới hạn một luồng; RF n_jobs=2. Mỗi pipeline dùng cấu hình tốt nhất đã lưu, fit một lần trên train và chấm validation; không lựa chọn lại theo số đo mới.</w:t>
+        <w:t>Ngày 19/10 đo năm lần mỗi pipeline trên AMD Ryzen 5 7235HS, 8 luồng logic, khoảng 16 GB RAM; Python 3.12.14, native pool=1, RF n_jobs=2. Mỗi lượt khởi tạo estimator mới, đổi thứ tự mô hình với seed 20261019, dùng cấu hình lịch sử cố định và cùng ma trận train/validation. Bảng báo trung vị [Q1; Q3].</w:t>
       </w:r>
     </w:p>
     <w:tbl>
@@ -10216,10 +10655,9 @@
         <w:tblLook w:firstColumn="1" w:firstRow="1" w:lastColumn="0" w:lastRow="0" w:noHBand="0" w:noVBand="1" w:val="04A0"/>
       </w:tblPr>
       <w:tblGrid>
-        <w:gridCol w:w="2353"/>
-        <w:gridCol w:w="2353"/>
-        <w:gridCol w:w="2353"/>
-        <w:gridCol w:w="2353"/>
+        <w:gridCol w:w="3137"/>
+        <w:gridCol w:w="3137"/>
+        <w:gridCol w:w="3137"/>
       </w:tblGrid>
       <w:tr>
         <w:trPr>
@@ -10228,7 +10666,7 @@
         </w:trPr>
         <w:tc>
           <w:tcPr>
-            <w:tcW w:type="dxa" w:w="2353"/>
+            <w:tcW w:type="dxa" w:w="3137"/>
             <w:shd w:fill="E8EEF2"/>
           </w:tcPr>
           <w:p>
@@ -10247,7 +10685,7 @@
         </w:tc>
         <w:tc>
           <w:tcPr>
-            <w:tcW w:type="dxa" w:w="2353"/>
+            <w:tcW w:type="dxa" w:w="3137"/>
             <w:shd w:fill="E8EEF2"/>
           </w:tcPr>
           <w:p>
@@ -10260,13 +10698,13 @@
                 <w:b/>
                 <w:sz w:val="22"/>
               </w:rPr>
-              <w:t>Fit classifier (s)</w:t>
-            </w:r>
-          </w:p>
-        </w:tc>
-        <w:tc>
-          <w:tcPr>
-            <w:tcW w:type="dxa" w:w="2353"/>
+              <w:t>Fit (s) trung vị [Q1; Q3]</w:t>
+            </w:r>
+          </w:p>
+        </w:tc>
+        <w:tc>
+          <w:tcPr>
+            <w:tcW w:type="dxa" w:w="3137"/>
             <w:shd w:fill="E8EEF2"/>
           </w:tcPr>
           <w:p>
@@ -10279,26 +10717,7 @@
                 <w:b/>
                 <w:sz w:val="22"/>
               </w:rPr>
-              <w:t>Chấm validation (ms)</w:t>
-            </w:r>
-          </w:p>
-        </w:tc>
-        <w:tc>
-          <w:tcPr>
-            <w:tcW w:type="dxa" w:w="2353"/>
-            <w:shd w:fill="E8EEF2"/>
-          </w:tcPr>
-          <w:p>
-            <w:pPr>
-              <w:spacing w:after="60"/>
-            </w:pPr>
-            <w:r>
-              <w:rPr>
-                <w:rFonts w:ascii="Times New Roman" w:hAnsi="Times New Roman"/>
-                <w:b/>
-                <w:sz w:val="22"/>
-              </w:rPr>
-              <w:t>AP validation</w:t>
+              <w:t>Chấm (ms) trung vị [Q1; Q3]</w:t>
             </w:r>
           </w:p>
         </w:tc>
@@ -10309,7 +10728,7 @@
         </w:trPr>
         <w:tc>
           <w:tcPr>
-            <w:tcW w:type="dxa" w:w="2353"/>
+            <w:tcW w:type="dxa" w:w="3137"/>
           </w:tcPr>
           <w:p>
             <w:pPr>
@@ -10327,7 +10746,7 @@
         </w:tc>
         <w:tc>
           <w:tcPr>
-            <w:tcW w:type="dxa" w:w="2353"/>
+            <w:tcW w:type="dxa" w:w="3137"/>
           </w:tcPr>
           <w:p>
             <w:pPr>
@@ -10339,13 +10758,13 @@
                 <w:b w:val="0"/>
                 <w:sz w:val="22"/>
               </w:rPr>
-              <w:t>66,02</w:t>
-            </w:r>
-          </w:p>
-        </w:tc>
-        <w:tc>
-          <w:tcPr>
-            <w:tcW w:type="dxa" w:w="2353"/>
+              <w:t>65,51 [64,39; 89,54]</w:t>
+            </w:r>
+          </w:p>
+        </w:tc>
+        <w:tc>
+          <w:tcPr>
+            <w:tcW w:type="dxa" w:w="3137"/>
           </w:tcPr>
           <w:p>
             <w:pPr>
@@ -10357,25 +10776,7 @@
                 <w:b w:val="0"/>
                 <w:sz w:val="22"/>
               </w:rPr>
-              <w:t>840,59</w:t>
-            </w:r>
-          </w:p>
-        </w:tc>
-        <w:tc>
-          <w:tcPr>
-            <w:tcW w:type="dxa" w:w="2353"/>
-          </w:tcPr>
-          <w:p>
-            <w:pPr>
-              <w:spacing w:after="60"/>
-            </w:pPr>
-            <w:r>
-              <w:rPr>
-                <w:rFonts w:ascii="Times New Roman" w:hAnsi="Times New Roman"/>
-                <w:b w:val="0"/>
-                <w:sz w:val="22"/>
-              </w:rPr>
-              <w:t>0,917</w:t>
+              <w:t>821,30 [819,71; 969,25]</w:t>
             </w:r>
           </w:p>
         </w:tc>
@@ -10386,7 +10787,7 @@
         </w:trPr>
         <w:tc>
           <w:tcPr>
-            <w:tcW w:type="dxa" w:w="2353"/>
+            <w:tcW w:type="dxa" w:w="3137"/>
           </w:tcPr>
           <w:p>
             <w:pPr>
@@ -10404,7 +10805,7 @@
         </w:tc>
         <w:tc>
           <w:tcPr>
-            <w:tcW w:type="dxa" w:w="2353"/>
+            <w:tcW w:type="dxa" w:w="3137"/>
           </w:tcPr>
           <w:p>
             <w:pPr>
@@ -10416,13 +10817,13 @@
                 <w:b w:val="0"/>
                 <w:sz w:val="22"/>
               </w:rPr>
-              <w:t>0,74</w:t>
-            </w:r>
-          </w:p>
-        </w:tc>
-        <w:tc>
-          <w:tcPr>
-            <w:tcW w:type="dxa" w:w="2353"/>
+              <w:t>0,83 [0,72; 0,84]</w:t>
+            </w:r>
+          </w:p>
+        </w:tc>
+        <w:tc>
+          <w:tcPr>
+            <w:tcW w:type="dxa" w:w="3137"/>
           </w:tcPr>
           <w:p>
             <w:pPr>
@@ -10434,25 +10835,7 @@
                 <w:b w:val="0"/>
                 <w:sz w:val="22"/>
               </w:rPr>
-              <w:t>3,00</w:t>
-            </w:r>
-          </w:p>
-        </w:tc>
-        <w:tc>
-          <w:tcPr>
-            <w:tcW w:type="dxa" w:w="2353"/>
-          </w:tcPr>
-          <w:p>
-            <w:pPr>
-              <w:spacing w:after="60"/>
-            </w:pPr>
-            <w:r>
-              <w:rPr>
-                <w:rFonts w:ascii="Times New Roman" w:hAnsi="Times New Roman"/>
-                <w:b w:val="0"/>
-                <w:sz w:val="22"/>
-              </w:rPr>
-              <w:t>0,904</w:t>
+              <w:t>3,71 [3,23; 4,03]</w:t>
             </w:r>
           </w:p>
         </w:tc>
@@ -10463,7 +10846,7 @@
         </w:trPr>
         <w:tc>
           <w:tcPr>
-            <w:tcW w:type="dxa" w:w="2353"/>
+            <w:tcW w:type="dxa" w:w="3137"/>
           </w:tcPr>
           <w:p>
             <w:pPr>
@@ -10481,7 +10864,7 @@
         </w:tc>
         <w:tc>
           <w:tcPr>
-            <w:tcW w:type="dxa" w:w="2353"/>
+            <w:tcW w:type="dxa" w:w="3137"/>
           </w:tcPr>
           <w:p>
             <w:pPr>
@@ -10493,13 +10876,13 @@
                 <w:b w:val="0"/>
                 <w:sz w:val="22"/>
               </w:rPr>
-              <w:t>1,95</w:t>
-            </w:r>
-          </w:p>
-        </w:tc>
-        <w:tc>
-          <w:tcPr>
-            <w:tcW w:type="dxa" w:w="2353"/>
+              <w:t>1,96 [1,92; 2,65]</w:t>
+            </w:r>
+          </w:p>
+        </w:tc>
+        <w:tc>
+          <w:tcPr>
+            <w:tcW w:type="dxa" w:w="3137"/>
           </w:tcPr>
           <w:p>
             <w:pPr>
@@ -10511,25 +10894,7 @@
                 <w:b w:val="0"/>
                 <w:sz w:val="22"/>
               </w:rPr>
-              <w:t>3,20</w:t>
-            </w:r>
-          </w:p>
-        </w:tc>
-        <w:tc>
-          <w:tcPr>
-            <w:tcW w:type="dxa" w:w="2353"/>
-          </w:tcPr>
-          <w:p>
-            <w:pPr>
-              <w:spacing w:after="60"/>
-            </w:pPr>
-            <w:r>
-              <w:rPr>
-                <w:rFonts w:ascii="Times New Roman" w:hAnsi="Times New Roman"/>
-                <w:b w:val="0"/>
-                <w:sz w:val="22"/>
-              </w:rPr>
-              <w:t>0,899</w:t>
+              <w:t>3,71 [3,31; 3,97]</w:t>
             </w:r>
           </w:p>
         </w:tc>
@@ -10540,7 +10905,7 @@
         </w:trPr>
         <w:tc>
           <w:tcPr>
-            <w:tcW w:type="dxa" w:w="2353"/>
+            <w:tcW w:type="dxa" w:w="3137"/>
           </w:tcPr>
           <w:p>
             <w:pPr>
@@ -10552,13 +10917,13 @@
                 <w:b w:val="0"/>
                 <w:sz w:val="22"/>
               </w:rPr>
-              <w:t>RandomForest</w:t>
-            </w:r>
-          </w:p>
-        </w:tc>
-        <w:tc>
-          <w:tcPr>
-            <w:tcW w:type="dxa" w:w="2353"/>
+              <w:t>NaiveBayes</w:t>
+            </w:r>
+          </w:p>
+        </w:tc>
+        <w:tc>
+          <w:tcPr>
+            <w:tcW w:type="dxa" w:w="3137"/>
           </w:tcPr>
           <w:p>
             <w:pPr>
@@ -10570,13 +10935,13 @@
                 <w:b w:val="0"/>
                 <w:sz w:val="22"/>
               </w:rPr>
-              <w:t>15,57</w:t>
-            </w:r>
-          </w:p>
-        </w:tc>
-        <w:tc>
-          <w:tcPr>
-            <w:tcW w:type="dxa" w:w="2353"/>
+              <w:t>0,02 [0,02; 0,02]</w:t>
+            </w:r>
+          </w:p>
+        </w:tc>
+        <w:tc>
+          <w:tcPr>
+            <w:tcW w:type="dxa" w:w="3137"/>
           </w:tcPr>
           <w:p>
             <w:pPr>
@@ -10588,25 +10953,7 @@
                 <w:b w:val="0"/>
                 <w:sz w:val="22"/>
               </w:rPr>
-              <w:t>295,64</w:t>
-            </w:r>
-          </w:p>
-        </w:tc>
-        <w:tc>
-          <w:tcPr>
-            <w:tcW w:type="dxa" w:w="2353"/>
-          </w:tcPr>
-          <w:p>
-            <w:pPr>
-              <w:spacing w:after="60"/>
-            </w:pPr>
-            <w:r>
-              <w:rPr>
-                <w:rFonts w:ascii="Times New Roman" w:hAnsi="Times New Roman"/>
-                <w:b w:val="0"/>
-                <w:sz w:val="22"/>
-              </w:rPr>
-              <w:t>0,900</w:t>
+              <w:t>8,61 [6,66; 9,13]</w:t>
             </w:r>
           </w:p>
         </w:tc>
@@ -10617,7 +10964,7 @@
         </w:trPr>
         <w:tc>
           <w:tcPr>
-            <w:tcW w:type="dxa" w:w="2353"/>
+            <w:tcW w:type="dxa" w:w="3137"/>
           </w:tcPr>
           <w:p>
             <w:pPr>
@@ -10629,13 +10976,13 @@
                 <w:b w:val="0"/>
                 <w:sz w:val="22"/>
               </w:rPr>
-              <w:t>NaiveBayes</w:t>
-            </w:r>
-          </w:p>
-        </w:tc>
-        <w:tc>
-          <w:tcPr>
-            <w:tcW w:type="dxa" w:w="2353"/>
+              <w:t>RandomForest</w:t>
+            </w:r>
+          </w:p>
+        </w:tc>
+        <w:tc>
+          <w:tcPr>
+            <w:tcW w:type="dxa" w:w="3137"/>
           </w:tcPr>
           <w:p>
             <w:pPr>
@@ -10647,13 +10994,13 @@
                 <w:b w:val="0"/>
                 <w:sz w:val="22"/>
               </w:rPr>
-              <w:t>0,01</w:t>
-            </w:r>
-          </w:p>
-        </w:tc>
-        <w:tc>
-          <w:tcPr>
-            <w:tcW w:type="dxa" w:w="2353"/>
+              <w:t>21,14 [16,00; 25,92]</w:t>
+            </w:r>
+          </w:p>
+        </w:tc>
+        <w:tc>
+          <w:tcPr>
+            <w:tcW w:type="dxa" w:w="3137"/>
           </w:tcPr>
           <w:p>
             <w:pPr>
@@ -10665,25 +11012,7 @@
                 <w:b w:val="0"/>
                 <w:sz w:val="22"/>
               </w:rPr>
-              <w:t>6,96</w:t>
-            </w:r>
-          </w:p>
-        </w:tc>
-        <w:tc>
-          <w:tcPr>
-            <w:tcW w:type="dxa" w:w="2353"/>
-          </w:tcPr>
-          <w:p>
-            <w:pPr>
-              <w:spacing w:after="60"/>
-            </w:pPr>
-            <w:r>
-              <w:rPr>
-                <w:rFonts w:ascii="Times New Roman" w:hAnsi="Times New Roman"/>
-                <w:b w:val="0"/>
-                <w:sz w:val="22"/>
-              </w:rPr>
-              <w:t>0,836</w:t>
+              <w:t>499,94 [307,62; 529,28]</w:t>
             </w:r>
           </w:p>
         </w:tc>
@@ -10691,7 +11020,7 @@
     </w:tbl>
     <w:p>
       <w:r>
-        <w:t>Tạo chung ba biểu diễn đầu vào mất 29,18 giây, được tách khỏi bảng thời gian classifier. Một lượt đo chỉ mô tả máy/lần chạy hiện tại, không dùng kết luận tăng tốc ổn định. Kết quả này có nguồn riêng benchmark.json và hardware.json; không thay số đo lịch sử ở mục 5.8 hoặc suy đoán phần cứng của lượt cũ.</w:t>
+        <w:t>Nguồn: results/generalization_2026-10-19/benchmark_repetitions.csv, benchmark_summary.csv và hardware.json. Fit và chấm validation đo riêng; preprocessing đo riêng một lượt. Năm lần lặp cùng máy/tiến trình mô tả biến động thời gian, không phải năm mẫu chất lượng độc lập hoặc kiểm thử tải API. Các số đo ngày 18/10 vẫn được lưu ở results/robustness.</w:t>
       </w:r>
     </w:p>
     <w:p>
@@ -11103,7 +11432,7 @@
     </w:p>
     <w:p>
       <w:r>
-        <w:t>Minh chứng tái lập toàn bộ quy trình chính ngày 11/10 được giữ trong reproduction_full.log và reproduction_check.json. Đợt 18/10 chạy mới nested CV, ablation SVM, calibration, đo tài nguyên và tính lại lát cắt profile; nhật ký ở evidence/robustness_2026-10-18.log. Kiểm thử, notebook và kiểm tra đóng gói được chạy lại sau cập nhật. Các phân tích mới không dùng test để chọn lại mô hình hoặc ngưỡng.</w:t>
+        <w:t>Lượt tái lập chính ngày 11/10 và các phân tích ngày 18/10 được giữ nguyên. Ngày 19/10 chạy thêm kiểm tra nhóm profile và 25 lượt benchmark; log ở evidence/generalization_2026-10-19.log. Kiểm thử và notebook được chạy lại; hash mô hình, ngưỡng, protocol và dự đoán test được đối chiếu không đổi.</w:t>
       </w:r>
     </w:p>
     <w:p>
@@ -11513,7 +11842,7 @@
                 <w:b w:val="0"/>
                 <w:sz w:val="26"/>
               </w:rPr>
-              <w:t>75,2% tin test có company_profile đã gặp trong train và nhãn profile ở train khớp nhãn test (mục 5.7). Nhóm không có hoặc chưa thấy profile (79% tin giả test): recall 79,8%, precision 72,2%. Cần chia theo company ID hoặc nhóm profile và dùng holdout mới.</w:t>
+              <w:t>Kiểm tra nhóm nội dung/profile bổ sung đạt AP 0,650 ± 0,177, biến động mạnh. Profile không phải company ID; cần dữ liệu mới chia theo doanh nghiệp hoặc thời gian trước pilot.</w:t>
             </w:r>
           </w:p>
         </w:tc>
@@ -11591,7 +11920,7 @@
                 <w:b w:val="0"/>
                 <w:sz w:val="26"/>
               </w:rPr>
-              <w:t>Đã nested CV 3×3 cho LR/SVM và ablation SVM; chưa nested chung RF/NB/GB, chưa chia theo doanh nghiệp hoặc đánh giá ngoài nguồn. Thí nghiệm sau khóa vẫn mang tính bổ sung.</w:t>
+              <w:t>Đã nested LR/SVM, ablation SVM và kiểm tra SVM cố định theo nhóm nội dung/profile. Chưa nested chung RF/NB/GB, chưa có company ID hoặc test ngoài nguồn. Benchmark đã lặp năm lần, giới hạn ở cùng máy.</w:t>
             </w:r>
           </w:p>
         </w:tc>

</xml_diff>

<commit_message>
docs: integrate reviewed report notebook and reproducibility evidence
</commit_message>
<xml_diff>
--- a/report/Bao_cao_Cuoi_ky_Nhom7_CRISP_DM.docx
+++ b/report/Bao_cao_Cuoi_ky_Nhom7_CRISP_DM.docx
@@ -189,7 +189,7 @@
         <w:br/>
         <w:t>Thực nghiệm chính: 11/10/2026</w:t>
         <w:br/>
-        <w:t>Thực nghiệm bổ sung và rà soát: 19/10/2026</w:t>
+        <w:t>Thực nghiệm bổ sung và rà soát: 20/10/2026</w:t>
       </w:r>
     </w:p>
     <w:p>
@@ -235,7 +235,7 @@
     </w:p>
     <w:p>
       <w:r>
-        <w:t>Báo cáo trình bày sáu giai đoạn CRISP-DM, kết quả khóa, phân tích sai số và độ bền. Thời gian chạy được đo lặp năm lần mỗi pipeline; dữ liệu, mã, manifest, notebook và minh chứng demo đi kèm để kiểm tra lại.</w:t>
+        <w:t>AP test 0,878 đánh giá pipeline đã khóa trên test nội bộ; AP 0,650 là chẩn đoán ba fold train tách profile. Cả hai là số đo thực nhưng chưa đủ ước lượng hiệu năng với doanh nghiệp mới. Không thay kết quả test hoặc lấy trung bình hai số. Thời gian chạy được đo lặp năm lần mỗi pipeline; mã, dữ liệu, notebook và minh chứng demo đi kèm.</w:t>
       </w:r>
     </w:p>
     <w:p>
@@ -6804,22 +6804,22 @@
         <w:pageBreakBefore/>
       </w:pPr>
       <w:r>
-        <w:t>5.7.1 Kiểm tra nhóm kết hợp nội dung và hồ sơ</w:t>
+        <w:t>5.7.1 Kiểm tra nhóm profile và phân tích fold 3</w:t>
       </w:r>
     </w:p>
     <w:p>
       <w:r>
-        <w:t>AP trung bình của SVM cố định là 0,650 ± 0,177 trên ba fold, dao động từ 0,446 đến 0,768. Kết quả cho thấy độ nhạy đáng kể theo nhóm hồ sơ và củng cố nhu cầu đánh giá với nhà tuyển dụng mới trước vận hành.</w:t>
+        <w:t>AP của SVM cố định là 0,650 ± 0,177 trên ba fold. Fold 3 chỉ đạt 0,446, so với 0,768 ở fold 2. Phân tích dự đoán đã lưu cho thấy tỷ lệ giả thấp hơn và các nhóm tin giả bị xếp sau nhiều tin thật hơn; chưa xác định nguyên nhân nhân quả.</w:t>
       </w:r>
     </w:p>
     <w:p>
       <w:r>
-        <w:t>Chỉ dùng 10.836 tin train. Hai tin được nối nếu chung content_group hoặc chung company_profile không rỗng sau chuẩn hóa chữ thường/khoảng trắng; lấy thành phần liên thông để xử lý nối bắc cầu. Có 3.256 nhóm, nhóm lớn nhất 589 tin; 1.987 tin thiếu profile chỉ được nhóm theo nội dung. Không gộp mọi profile thiếu thành một công ty.</w:t>
+        <w:t>Dùng 10.836 tin train; nối tin chung content_group hoặc profile không rỗng sau chuẩn hóa chữ thường/khoảng trắng, kể cả nối bắc cầu. Có 3.256 nhóm; 1.987 tin thiếu profile chỉ nhóm theo nội dung. StratifiedGroupKFold 3 fold, seed 20261019; SVM C=1, class_weight=None cố định, preprocessing fit riêng từng fold.</w:t>
       </w:r>
     </w:p>
     <w:p>
       <w:r>
-        <w:t>StratifiedGroupKFold 3 fold, seed 20261019; SVM C=1, class_weight=None cố định, preprocessing fit riêng mỗi fold. Các cột giao nhóm nội dung và giao profile không rỗng đều bằng 0. Mỗi tin train được chấm đúng một lần; cả tập fit và eval từng fold đều có đủ hai lớp.</w:t>
+        <w:t>Mỗi tin được chấm đúng một lần; không giao nhóm nội dung/profile giữa fit và eval, cả hai phần đều đủ hai lớp. Nhóm lớn khiến splitter chỉ có thể xấp xỉ tỷ lệ lớp [3]. Bảng dưới thêm ROC-AUC để mô tả khả năng xếp hạng bên cạnh AP.</w:t>
       </w:r>
     </w:p>
     <w:tbl>
@@ -6874,7 +6874,7 @@
                 <w:b/>
                 <w:sz w:val="22"/>
               </w:rPr>
-              <w:t>Tin fit / giả</w:t>
+              <w:t>Tin eval / giả</w:t>
             </w:r>
           </w:p>
         </w:tc>
@@ -6893,7 +6893,7 @@
                 <w:b/>
                 <w:sz w:val="22"/>
               </w:rPr>
-              <w:t>Tin eval / giả</w:t>
+              <w:t>Tỷ lệ giả</w:t>
             </w:r>
           </w:p>
         </w:tc>
@@ -6912,7 +6912,7 @@
                 <w:b/>
                 <w:sz w:val="22"/>
               </w:rPr>
-              <w:t>AP</w:t>
+              <w:t>AP / ROC-AUC</w:t>
             </w:r>
           </w:p>
         </w:tc>
@@ -6931,7 +6931,7 @@
                 <w:b/>
                 <w:sz w:val="22"/>
               </w:rPr>
-              <w:t>Giao nhóm</w:t>
+              <w:t>Nhóm lớn nhất</w:t>
             </w:r>
           </w:p>
         </w:tc>
@@ -6972,7 +6972,7 @@
                 <w:b w:val="0"/>
                 <w:sz w:val="22"/>
               </w:rPr>
-              <w:t>7007 / 315</w:t>
+              <w:t>3829 / 215</w:t>
             </w:r>
           </w:p>
         </w:tc>
@@ -6990,7 +6990,7 @@
                 <w:b w:val="0"/>
                 <w:sz w:val="22"/>
               </w:rPr>
-              <w:t>3829 / 215</w:t>
+              <w:t>5,62%</w:t>
             </w:r>
           </w:p>
         </w:tc>
@@ -7008,7 +7008,7 @@
                 <w:b w:val="0"/>
                 <w:sz w:val="22"/>
               </w:rPr>
-              <w:t>0,736</w:t>
+              <w:t>0,736 / 0,939</w:t>
             </w:r>
           </w:p>
         </w:tc>
@@ -7026,7 +7026,7 @@
                 <w:b w:val="0"/>
                 <w:sz w:val="22"/>
               </w:rPr>
-              <w:t>0</w:t>
+              <w:t>323 tin</w:t>
             </w:r>
           </w:p>
         </w:tc>
@@ -7067,7 +7067,7 @@
                 <w:b w:val="0"/>
                 <w:sz w:val="22"/>
               </w:rPr>
-              <w:t>8122 / 385</w:t>
+              <w:t>2714 / 145</w:t>
             </w:r>
           </w:p>
         </w:tc>
@@ -7085,7 +7085,7 @@
                 <w:b w:val="0"/>
                 <w:sz w:val="22"/>
               </w:rPr>
-              <w:t>2714 / 145</w:t>
+              <w:t>5,34%</w:t>
             </w:r>
           </w:p>
         </w:tc>
@@ -7103,7 +7103,7 @@
                 <w:b w:val="0"/>
                 <w:sz w:val="22"/>
               </w:rPr>
-              <w:t>0,768</w:t>
+              <w:t>0,768 / 0,944</w:t>
             </w:r>
           </w:p>
         </w:tc>
@@ -7121,7 +7121,7 @@
                 <w:b w:val="0"/>
                 <w:sz w:val="22"/>
               </w:rPr>
-              <w:t>0</w:t>
+              <w:t>57 tin</w:t>
             </w:r>
           </w:p>
         </w:tc>
@@ -7162,7 +7162,7 @@
                 <w:b w:val="0"/>
                 <w:sz w:val="22"/>
               </w:rPr>
-              <w:t>6543 / 360</w:t>
+              <w:t>4293 / 170</w:t>
             </w:r>
           </w:p>
         </w:tc>
@@ -7180,7 +7180,7 @@
                 <w:b w:val="0"/>
                 <w:sz w:val="22"/>
               </w:rPr>
-              <w:t>4293 / 170</w:t>
+              <w:t>3,96%</w:t>
             </w:r>
           </w:p>
         </w:tc>
@@ -7198,7 +7198,7 @@
                 <w:b w:val="0"/>
                 <w:sz w:val="22"/>
               </w:rPr>
-              <w:t>0,446</w:t>
+              <w:t>0,446 / 0,864</w:t>
             </w:r>
           </w:p>
         </w:tc>
@@ -7216,7 +7216,7 @@
                 <w:b w:val="0"/>
                 <w:sz w:val="22"/>
               </w:rPr>
-              <w:t>0</w:t>
+              <w:t>589 tin</w:t>
             </w:r>
           </w:p>
         </w:tc>
@@ -7224,17 +7224,22 @@
     </w:tbl>
     <w:p>
       <w:r>
-        <w:t>Phân tầng theo nhóm chỉ cố gắng giữ tỷ lệ lớp, không bảo đảm số mẫu bằng nhau [3]. Số tin giả eval lần lượt 215, 145 và 170; kích thước nhóm hạn chế khả năng cân bằng. SD trên ba fold mô tả biến động, không phải khoảng tin cậy.</w:t>
+        <w:t>Fold 3 có 3,96% tin giả, thấp hơn 5,34% ở fold 2. Tuy nhiên ROC-AUC cũng giảm từ 0,944 xuống 0,864; trung vị số tin thật đứng trước hoặc bằng điểm một tin giả tăng từ 6 lên 237. Vì thế không quy toàn bộ chênh AP cho tỷ lệ lớp. Thứ hạng dùng điểm cuối nhóm đồng điểm, không phá tie theo ID.</w:t>
       </w:r>
     </w:p>
     <w:p>
       <w:r>
-        <w:t>Cấu hình đã được chọn trên train trước đây nên đây là chẩn đoán sau khóa, chưa phải nested CV theo profile. Profile khớp chính xác vẫn không tương đương company ID: cùng doanh nghiệp có thể viết khác, nhiều doanh nghiệp có thể dùng chung mẫu. Thiết kế cũng đổi seed, tập fit và phân bố; không quy toàn bộ chênh AP với CV cũ cho rò rỉ doanh nghiệp.</w:t>
+        <w:t>Nhóm lớn nhất 17 (589 tin) và nhóm 9 (359 tin) cùng nằm ở fold 3, đều toàn tin thật. Trong các cặp tin thật có score ≥ tin giả, hai nhóm lần lượt chiếm 5,26% và 28,84%; nhóm lớn nhất không mặc nhiên là nguồn lỗi chính. Đây là thống kê thứ tự, không phải số FP tại ngưỡng triển khai.</w:t>
       </w:r>
     </w:p>
     <w:p>
       <w:r>
-        <w:t>Nguồn: scripts/audit_generalization.py và results/generalization_2026-10-19/profile_folds.csv, profile_predictions.csv, profile_group_manifest.csv. Kết quả test, mô hình và ngưỡng triển khai không đổi. Chưa có dữ liệu ngoài nguồn được xác minh để thực hiện đánh giá xác nhận.</w:t>
+        <w:t>Hai nhóm 3389 và 2901 có 41 và 11 tin giả, chiếm 30,59% tin giả fold 3. Thứ hạng trung vị là 559 và 1.170; precision trung bình tại score các tin giả chỉ 0,225 và 0,150. Ngược lại, nhóm 20 tin giả lớn nhất của fold 2 có precision tại score bằng 1. Thành phần nhóm cho thấy khác biệt độ khó đáng kể; logo đều có ở hai nhóm giả của fold 3 nên không bảo đảm tin thật.</w:t>
+      </w:r>
+    </w:p>
+    <w:p>
+      <w:r>
+        <w:t>Chi tiết ở PHAN_TICH_FOLD_PROFILE.md và results/fold_diagnostics_2026-10-20/. Phân tích hậu kiểm không đổi fold hoặc loại nhóm khó. C đã chọn trước trên train, profile không phải company ID, SD ba fold không phải khoảng tin cậy; chưa phải nested theo doanh nghiệp hay test ngoài nguồn.</w:t>
       </w:r>
     </w:p>
     <w:p>
@@ -11432,7 +11437,7 @@
     </w:p>
     <w:p>
       <w:r>
-        <w:t>Lượt tái lập chính ngày 11/10 và các phân tích ngày 18/10 được giữ nguyên. Ngày 19/10 chạy thêm kiểm tra nhóm profile và 25 lượt benchmark; log ở evidence/generalization_2026-10-19.log. Kiểm thử và notebook được chạy lại; hash mô hình, ngưỡng, protocol và dự đoán test được đối chiếu không đổi.</w:t>
+        <w:t>Lượt tái lập chính ngày 11/10, các thực nghiệm ngày 18–19/10 được giữ nguyên. Ngày 20/10 chỉ phân tích dự đoán đã lưu: thành phần fold, thứ hạng và đóng góp nhóm vào AP; không fit lại. scripts/verify_fold_diagnostics.py tính lại các thống kê; kiểm thử và notebook được chạy lại, hash mô hình/ngưỡng/dự đoán test không đổi.</w:t>
       </w:r>
     </w:p>
     <w:p>

</xml_diff>